<commit_message>
main part of r shiny live clearup
</commit_message>
<xml_diff>
--- a/docs/factsheets/f-chisquareddist.docx
+++ b/docs/factsheets/f-chisquareddist.docx
@@ -1574,7 +1574,6 @@
     </w:p>
     <w:p>
       <w:pPr>
-        <w:pStyle w:val="Compact"/>
         <w:numPr>
           <w:ilvl w:val="0"/>
           <w:numId w:val="1002"/>
@@ -1599,6 +1598,17 @@
       </w:r>
       <w:r>
         <w:t xml:space="preserve">by tdhc.</w:t>
+      </w:r>
+    </w:p>
+    <w:p>
+      <w:pPr>
+        <w:numPr>
+          <w:ilvl w:val="0"/>
+          <w:numId w:val="1002"/>
+        </w:numPr>
+      </w:pPr>
+      <w:r>
+        <w:t xml:space="preserve">v1.2: deprecated shinylive apps replaced 09/26 by tdhc.</w:t>
       </w:r>
     </w:p>
     <w:p>

</xml_diff>